<commit_message>
docs: actualizar Taller Metodología Scrum
</commit_message>
<xml_diff>
--- a/documentos_taller/Taller Metodología Scrum.docx
+++ b/documentos_taller/Taller Metodología Scrum.docx
@@ -1547,39 +1547,22 @@
           <w:sz w:val="20"/>
           <w:szCs w:val="20"/>
         </w:rPr>
-        <w:t xml:space="preserve">Cada Developer clona el proyecto con </w:t>
-      </w:r>
-      <w:proofErr w:type="spellStart"/>
-      <w:r>
-        <w:rPr>
-          <w:rFonts w:ascii="Verdana" w:eastAsia="Verdana" w:hAnsi="Verdana" w:cs="Verdana"/>
-          <w:color w:val="000000"/>
-          <w:sz w:val="20"/>
-          <w:szCs w:val="20"/>
-        </w:rPr>
-        <w:t>git</w:t>
-      </w:r>
-      <w:proofErr w:type="spellEnd"/>
-      <w:r>
-        <w:rPr>
-          <w:rFonts w:ascii="Verdana" w:eastAsia="Verdana" w:hAnsi="Verdana" w:cs="Verdana"/>
-          <w:color w:val="000000"/>
-          <w:sz w:val="20"/>
-          <w:szCs w:val="20"/>
-        </w:rPr>
-        <w:t xml:space="preserve"> clone </w:t>
+        <w:t xml:space="preserve">Cada Developer clona el proyecto con git clone </w:t>
       </w:r>
       <w:hyperlink r:id="rId8" w:history="1">
         <w:r>
           <w:rPr>
             <w:rStyle w:val="Hipervnculo"/>
-            <w:rFonts w:ascii="Verdana" w:eastAsia="Verdana" w:hAnsi="Verdana" w:cs="Verdana"/>
+            <w:rFonts w:ascii="Vedrana" w:hAnsi="Vedrana"/>
             <w:sz w:val="20"/>
             <w:szCs w:val="20"/>
           </w:rPr>
-          <w:t>https://github.com/NatalieBM1/ProyectoVoxel.git</w:t>
+          <w:t>https://github.com/NatalieBM1/Voxel.git</w:t>
         </w:r>
       </w:hyperlink>
+      <w:r>
+        <w:t xml:space="preserve"> </w:t>
+      </w:r>
       <w:r>
         <w:rPr>
           <w:color w:val="000000"/>
@@ -1627,17 +1610,15 @@
         </w:rPr>
         <w:t xml:space="preserve">Cambiarse a la rama de su equipo (el nombre sigue el patrón Br_EquipoN, por </w:t>
       </w:r>
-      <w:proofErr w:type="gramStart"/>
-      <w:r>
-        <w:rPr>
-          <w:rFonts w:ascii="Verdana" w:eastAsia="Verdana" w:hAnsi="Verdana" w:cs="Verdana"/>
-          <w:color w:val="000000"/>
-          <w:sz w:val="20"/>
-          <w:szCs w:val="20"/>
-        </w:rPr>
-        <w:t>ejemplo</w:t>
-      </w:r>
-      <w:proofErr w:type="gramEnd"/>
+      <w:r>
+        <w:rPr>
+          <w:rFonts w:ascii="Verdana" w:eastAsia="Verdana" w:hAnsi="Verdana" w:cs="Verdana"/>
+          <w:color w:val="000000"/>
+          <w:sz w:val="20"/>
+          <w:szCs w:val="20"/>
+        </w:rPr>
+        <w:t>ejemplo,</w:t>
+      </w:r>
       <w:r>
         <w:rPr>
           <w:rFonts w:ascii="Verdana" w:eastAsia="Verdana" w:hAnsi="Verdana" w:cs="Verdana"/>
@@ -4237,7 +4218,6 @@
   <w:style w:type="character" w:default="1" w:styleId="Fuentedeprrafopredeter">
     <w:name w:val="Default Paragraph Font"/>
     <w:uiPriority w:val="1"/>
-    <w:semiHidden/>
     <w:unhideWhenUsed/>
   </w:style>
   <w:style w:type="table" w:default="1" w:styleId="Tablanormal">

</xml_diff>